<commit_message>
Add Line Numbers menu items, options dialog and icon
Co-Authored-By: Claude Opus 5.5 <noreply@anthropic.com>
</commit_message>
<xml_diff>
--- a/src/documents/public/fixtures/line-numbers.docx
+++ b/src/documents/public/fixtures/line-numbers.docx
@@ -116,7 +116,7 @@
     </w:p>
     <w:p>
       <w:r>
-        <w:t xml:space="preserve">Second section: two columns, every fifth line, starting at 10. Numbered lines help reviewers point at a passage: each line of this paragraph wraps several times so the margin shows a column of small numbers beside it. Numbered lines help reviewers point at a passage: each line of this paragraph wraps several times so the margin shows a column of small numbers beside it. Numbered lines help reviewers point at a passage: each line of this paragraph wraps several times so the margin shows a column of small numbers beside it. Numbered lines help reviewers point at a passage: each line of this paragraph wraps several times so the margin shows a column of small numbers beside it. Numbered lines help reviewers point at a passage: each line of this paragraph wraps several times so the margin shows a column of small numbers beside it. Numbered lines help reviewers point at a passage: each line of this paragraph wraps several times so the margin shows a column of small numbers beside it. Numbered lines help reviewers point at a passage: each line of this paragraph wraps several times so the margin shows a column of small numbers beside it. Numbered lines help reviewers point at a passage: each line of this paragraph wraps several times so the margin shows a column of small numbers beside it. Numbered lines help reviewers point at a passage: each line of this paragraph wraps several times so the margin shows a column of small numbers beside it. Numbered lines help reviewers point at a passage: each line of this paragraph wraps several times so the margin shows a column of small numbers beside it. Numbered lines help reviewers point at a passage: each line of this paragraph wraps several times so the margin shows a column of small numbers beside it. Numbered lines help reviewers point at a passage: each line of this paragraph wraps several times so the margin shows a column of small numbers beside it. Numbered lines help reviewers point at a passage: each line of this paragraph wraps several times so the margin shows a column of small numbers beside it. Numbered lines help reviewers point at a passage: each line of this paragraph wraps several times so the margin shows a column of small numbers beside it. </w:t>
+        <w:t xml:space="preserve">Second section: two columns, every fifth line, restarting at 10. Numbered lines help reviewers point at a passage: each line of this paragraph wraps several times so the margin shows a column of small numbers beside it. Numbered lines help reviewers point at a passage: each line of this paragraph wraps several times so the margin shows a column of small numbers beside it. Numbered lines help reviewers point at a passage: each line of this paragraph wraps several times so the margin shows a column of small numbers beside it. Numbered lines help reviewers point at a passage: each line of this paragraph wraps several times so the margin shows a column of small numbers beside it. Numbered lines help reviewers point at a passage: each line of this paragraph wraps several times so the margin shows a column of small numbers beside it. Numbered lines help reviewers point at a passage: each line of this paragraph wraps several times so the margin shows a column of small numbers beside it. Numbered lines help reviewers point at a passage: each line of this paragraph wraps several times so the margin shows a column of small numbers beside it. Numbered lines help reviewers point at a passage: each line of this paragraph wraps several times so the margin shows a column of small numbers beside it. Numbered lines help reviewers point at a passage: each line of this paragraph wraps several times so the margin shows a column of small numbers beside it. Numbered lines help reviewers point at a passage: each line of this paragraph wraps several times so the margin shows a column of small numbers beside it. Numbered lines help reviewers point at a passage: each line of this paragraph wraps several times so the margin shows a column of small numbers beside it. Numbered lines help reviewers point at a passage: each line of this paragraph wraps several times so the margin shows a column of small numbers beside it. Numbered lines help reviewers point at a passage: each line of this paragraph wraps several times so the margin shows a column of small numbers beside it. Numbered lines help reviewers point at a passage: each line of this paragraph wraps several times so the margin shows a column of small numbers beside it. </w:t>
       </w:r>
     </w:p>
     <w:p>
@@ -128,7 +128,7 @@
       <w:type w:val="nextPage"/>
       <w:pgSz w:w="12240" w:h="15840"/>
       <w:pgMar w:top="1440" w:right="1440" w:bottom="1440" w:left="1440" w:header="720" w:footer="720" w:gutter="0"/>
-      <w:lnNumType w:countBy="5" w:start="9" w:distance="288" w:restart="continuous"/>
+      <w:lnNumType w:countBy="5" w:start="9" w:distance="288" w:restart="newSection"/>
       <w:cols w:num="2" w:space="720"/>
     </w:sectPr>
   </w:body>

</xml_diff>